<commit_message>
docs: mise a jour des 3 guides (manuel + comprendre memoire + archi) + .docx
MODE_EMPLOI : 3 nouveaux chapitres (tableau de bord vivant, import par lot &
tri d'ingestion, continuite des contrats CDD/prolongation) + sommaire.
COMPRENDRE_MEMOIRE_IA : chapitre « les documents qui dorment » (3 couches
memoire, ce doc nourrit-il la memoire vivante, l'humain valide).
COMPRENDRE_ARCHITECTURE : moteur de signaux (4 couches, 1 source N surfaces)
+ pipeline d'ingestion documentaire (classify -> triage -> embedding selectif).

Generateur md-to-docx : gere desormais les admonitions « > [!TYPE] Titre »
(label en gras + contenu indente) et les citations simples.

.docx regeneres (docs/ + copies servables public/manuel|comprendre-*.docx).

Co-Authored-By: Claude Opus 4.7 <noreply@anthropic.com>
</commit_message>
<xml_diff>
--- a/docs/COMPRENDRE_ARCHITECTURE.docx
+++ b/docs/COMPRENDRE_ARCHITECTURE.docx
@@ -11,79 +11,76 @@
       </w:r>
     </w:p>
     <w:p>
-      <w:r>
-        <w:t xml:space="preserve">&gt; </w:t>
-      </w:r>
+      <w:pPr>
+        <w:ind w:left="340"/>
+      </w:pPr>
       <w:r>
         <w:rPr>
           <w:b/>
         </w:rPr>
         <w:t>Pour Vincent et toute personne qui veut comprendre comment MemorIA est construit, sans être ingénieur.</w:t>
-      </w:r>
-      <w:r>
-        <w:t xml:space="preserve"> &gt; &gt; Chaque notion suit le même plan : </w:t>
-      </w:r>
-      <w:r>
-        <w:rPr>
-          <w:i/>
-        </w:rPr>
-        <w:t>« c'est quoi »</w:t>
-      </w:r>
-      <w:r>
-        <w:t xml:space="preserve"> (analogie simple) → </w:t>
-      </w:r>
-      <w:r>
-        <w:rPr>
-          <w:i/>
-        </w:rPr>
-        <w:t>« pourquoi ça existe »</w:t>
-      </w:r>
-      <w:r>
-        <w:t xml:space="preserve"> → </w:t>
-      </w:r>
-      <w:r>
-        <w:rPr>
-          <w:i/>
-        </w:rPr>
-        <w:t>« comment c'est appliqué chez nous »</w:t>
-      </w:r>
-      <w:r>
-        <w:t xml:space="preserve"> (exemple concret). &gt; &gt; Pas de jargon gratuit. Si un mot technique apparaît, il est expliqué.</w:t>
       </w:r>
     </w:p>
     <w:p>
       <w:pPr>
-        <w:jc w:val="center"/>
-      </w:pPr>
-      <w:r>
-        <w:rPr>
-          <w:color w:val="6B6B6B"/>
-        </w:rPr>
-        <w:t>────────────────────────────────────────</w:t>
+        <w:ind w:left="340"/>
+      </w:pPr>
+      <w:r>
+        <w:t xml:space="preserve">Chaque notion suit le même plan : </w:t>
+      </w:r>
+      <w:r>
+        <w:rPr>
+          <w:i/>
+        </w:rPr>
+        <w:t>« c'est quoi »</w:t>
+      </w:r>
+      <w:r>
+        <w:t xml:space="preserve"> (analogie simple) → </w:t>
+      </w:r>
+      <w:r>
+        <w:rPr>
+          <w:i/>
+        </w:rPr>
+        <w:t>« pourquoi ça existe »</w:t>
+      </w:r>
+      <w:r>
+        <w:t xml:space="preserve"> → </w:t>
+      </w:r>
+      <w:r>
+        <w:rPr>
+          <w:i/>
+        </w:rPr>
+        <w:t>« comment c'est appliqué chez nous »</w:t>
+      </w:r>
+      <w:r>
+        <w:t xml:space="preserve"> (exemple concret).</w:t>
       </w:r>
     </w:p>
     <w:p>
       <w:pPr>
-        <w:pStyle w:val="Heading2"/>
-      </w:pPr>
-      <w:r>
-        <w:t>Sommaire</w:t>
+        <w:ind w:left="340"/>
+      </w:pPr>
+      <w:r>
+        <w:t>Pas de jargon gratuit. Si un mot technique apparaît, il est expliqué.</w:t>
       </w:r>
     </w:p>
     <w:p>
       <w:pPr>
-        <w:pStyle w:val="ListBullet"/>
-      </w:pPr>
-      <w:r>
-        <w:t>[Partie 1 — Où vivent les données (les fondations)](#partie-1--où-vivent-les-données)</w:t>
+        <w:jc w:val="center"/>
+      </w:pPr>
+      <w:r>
+        <w:rPr>
+          <w:color w:val="6B6B6B"/>
+        </w:rPr>
+        <w:t>────────────────────────────────────────</w:t>
       </w:r>
     </w:p>
     <w:p>
       <w:pPr>
-        <w:pStyle w:val="ListBullet"/>
-      </w:pPr>
-      <w:r>
-        <w:t>[Partie 2 — Comment le sens est calculé (la couche IA)](#partie-2--comment-le-sens-est-calculé)</w:t>
+        <w:pStyle w:val="Heading2"/>
+      </w:pPr>
+      <w:r>
+        <w:t>Sommaire</w:t>
       </w:r>
     </w:p>
     <w:p>
@@ -91,7 +88,7 @@
         <w:pStyle w:val="ListBullet"/>
       </w:pPr>
       <w:r>
-        <w:t>[Partie 3 — Comment l'application tourne (Next.js)](#partie-3--comment-lapplication-tourne)</w:t>
+        <w:t>[Partie 1 — Où vivent les données (les fondations)](#partie-1--où-vivent-les-données)</w:t>
       </w:r>
     </w:p>
     <w:p>
@@ -99,7 +96,7 @@
         <w:pStyle w:val="ListBullet"/>
       </w:pPr>
       <w:r>
-        <w:t>[Partie 4 — Les garde-fous (sécurité &amp; doctrine)](#partie-4--les-garde-fous)</w:t>
+        <w:t>[Partie 2 — Comment le sens est calculé (la couche IA)](#partie-2--comment-le-sens-est-calculé)</w:t>
       </w:r>
     </w:p>
     <w:p>
@@ -107,7 +104,7 @@
         <w:pStyle w:val="ListBullet"/>
       </w:pPr>
       <w:r>
-        <w:t>[Partie 5 — Les patterns d'exécution](#partie-5--les-patterns-dexécution)</w:t>
+        <w:t>[Partie 3 — Comment l'application tourne (Next.js)](#partie-3--comment-lapplication-tourne)</w:t>
       </w:r>
     </w:p>
     <w:p>
@@ -115,68 +112,50 @@
         <w:pStyle w:val="ListBullet"/>
       </w:pPr>
       <w:r>
-        <w:t>[Partie 6 — Vocabulaire express](#partie-6--vocabulaire-express)</w:t>
+        <w:t>[Partie 4 — Les garde-fous (sécurité &amp; doctrine)](#partie-4--les-garde-fous)</w:t>
       </w:r>
     </w:p>
     <w:p>
       <w:pPr>
-        <w:jc w:val="center"/>
-      </w:pPr>
-      <w:r>
-        <w:rPr>
-          <w:color w:val="6B6B6B"/>
-        </w:rPr>
-        <w:t>────────────────────────────────────────</w:t>
+        <w:pStyle w:val="ListBullet"/>
+      </w:pPr>
+      <w:r>
+        <w:t>[Partie 5 — Les patterns d'exécution](#partie-5--les-patterns-dexécution)</w:t>
       </w:r>
     </w:p>
     <w:p>
       <w:pPr>
-        <w:pStyle w:val="Heading1"/>
-      </w:pPr>
-      <w:r>
-        <w:t>Partie 1 — Où vivent les données</w:t>
+        <w:pStyle w:val="ListBullet"/>
+      </w:pPr>
+      <w:r>
+        <w:t>[Partie 6 — Vocabulaire express](#partie-6--vocabulaire-express)</w:t>
       </w:r>
     </w:p>
     <w:p>
       <w:pPr>
-        <w:pStyle w:val="Heading2"/>
-      </w:pPr>
-      <w:r>
-        <w:t>1.1 — La base de données (Postgres)</w:t>
+        <w:jc w:val="center"/>
+      </w:pPr>
+      <w:r>
+        <w:rPr>
+          <w:color w:val="6B6B6B"/>
+        </w:rPr>
+        <w:t>────────────────────────────────────────</w:t>
       </w:r>
     </w:p>
     <w:p>
-      <w:r>
-        <w:rPr>
-          <w:b/>
-        </w:rPr>
-        <w:t>C'est quoi</w:t>
-      </w:r>
-      <w:r>
-        <w:t xml:space="preserve"> : une base de données, c'est un </w:t>
-      </w:r>
-      <w:r>
-        <w:rPr>
-          <w:b/>
-        </w:rPr>
-        <w:t>classeur géant</w:t>
-      </w:r>
-      <w:r>
-        <w:t xml:space="preserve"> organisé en tableaux. Chaque tableau (on dit « table ») a des colonnes (les champs) et des lignes (les enregistrements).</w:t>
+      <w:pPr>
+        <w:pStyle w:val="Heading1"/>
+      </w:pPr>
+      <w:r>
+        <w:t>Partie 1 — Où vivent les données</w:t>
       </w:r>
     </w:p>
     <w:p>
-      <w:r>
-        <w:t xml:space="preserve">&gt; </w:t>
-      </w:r>
-      <w:r>
-        <w:rPr>
-          <w:b/>
-        </w:rPr>
-        <w:t>Analogie</w:t>
-      </w:r>
-      <w:r>
-        <w:t xml:space="preserve"> : un tableur Excel, mais en beaucoup plus costaud, capable de gérer des millions de lignes et de relier les tableaux entre eux.</w:t>
+      <w:pPr>
+        <w:pStyle w:val="Heading2"/>
+      </w:pPr>
+      <w:r>
+        <w:t>1.1 — La base de données (Postgres)</w:t>
       </w:r>
     </w:p>
     <w:p>
@@ -184,13 +163,47 @@
         <w:rPr>
           <w:b/>
         </w:rPr>
-        <w:t>Postgres</w:t>
-      </w:r>
-      <w:r>
-        <w:t xml:space="preserve"> (ou PostgreSQL) est le moteur de base de données qu'on utilise. C'est l'un des plus solides et respectés au monde, gratuit et open-source.</w:t>
+        <w:t>C'est quoi</w:t>
+      </w:r>
+      <w:r>
+        <w:t xml:space="preserve"> : une base de données, c'est un </w:t>
+      </w:r>
+      <w:r>
+        <w:rPr>
+          <w:b/>
+        </w:rPr>
+        <w:t>classeur géant</w:t>
+      </w:r>
+      <w:r>
+        <w:t xml:space="preserve"> organisé en tableaux. Chaque tableau (on dit « table ») a des colonnes (les champs) et des lignes (les enregistrements).</w:t>
       </w:r>
     </w:p>
     <w:p>
+      <w:pPr>
+        <w:ind w:left="340"/>
+      </w:pPr>
+      <w:r>
+        <w:rPr>
+          <w:b/>
+        </w:rPr>
+        <w:t>Analogie</w:t>
+      </w:r>
+      <w:r>
+        <w:t xml:space="preserve"> : un tableur Excel, mais en beaucoup plus costaud, capable de gérer des millions de lignes et de relier les tableaux entre eux.</w:t>
+      </w:r>
+    </w:p>
+    <w:p>
+      <w:r>
+        <w:rPr>
+          <w:b/>
+        </w:rPr>
+        <w:t>Postgres</w:t>
+      </w:r>
+      <w:r>
+        <w:t xml:space="preserve"> (ou PostgreSQL) est le moteur de base de données qu'on utilise. C'est l'un des plus solides et respectés au monde, gratuit et open-source.</w:t>
+      </w:r>
+    </w:p>
+    <w:p>
       <w:r>
         <w:rPr>
           <w:b/>
@@ -379,9 +392,9 @@
       </w:r>
     </w:p>
     <w:p>
-      <w:r>
-        <w:t xml:space="preserve">&gt; </w:t>
-      </w:r>
+      <w:pPr>
+        <w:ind w:left="340"/>
+      </w:pPr>
       <w:r>
         <w:rPr>
           <w:b/>
@@ -462,9 +475,9 @@
       </w:r>
     </w:p>
     <w:p>
-      <w:r>
-        <w:t xml:space="preserve">&gt; </w:t>
-      </w:r>
+      <w:pPr>
+        <w:ind w:left="340"/>
+      </w:pPr>
       <w:r>
         <w:rPr>
           <w:b/>
@@ -606,9 +619,9 @@
       </w:r>
     </w:p>
     <w:p>
-      <w:r>
-        <w:t xml:space="preserve">&gt; </w:t>
-      </w:r>
+      <w:pPr>
+        <w:ind w:left="340"/>
+      </w:pPr>
       <w:r>
         <w:rPr>
           <w:b/>
@@ -710,9 +723,9 @@
       </w:r>
     </w:p>
     <w:p>
-      <w:r>
-        <w:t xml:space="preserve">&gt; </w:t>
-      </w:r>
+      <w:pPr>
+        <w:ind w:left="340"/>
+      </w:pPr>
       <w:r>
         <w:rPr>
           <w:b/>
@@ -866,9 +879,9 @@
       </w:r>
     </w:p>
     <w:p>
-      <w:r>
-        <w:t xml:space="preserve">&gt; </w:t>
-      </w:r>
+      <w:pPr>
+        <w:ind w:left="340"/>
+      </w:pPr>
       <w:r>
         <w:rPr>
           <w:b/>
@@ -988,9 +1001,9 @@
       </w:r>
     </w:p>
     <w:p>
-      <w:r>
-        <w:t xml:space="preserve">&gt; </w:t>
-      </w:r>
+      <w:pPr>
+        <w:ind w:left="340"/>
+      </w:pPr>
       <w:r>
         <w:rPr>
           <w:b/>
@@ -1092,9 +1105,9 @@
       </w:r>
     </w:p>
     <w:p>
-      <w:r>
-        <w:t xml:space="preserve">&gt; </w:t>
-      </w:r>
+      <w:pPr>
+        <w:ind w:left="340"/>
+      </w:pPr>
       <w:r>
         <w:rPr>
           <w:b/>
@@ -1216,9 +1229,9 @@
       </w:r>
     </w:p>
     <w:p>
-      <w:r>
-        <w:t xml:space="preserve">&gt; </w:t>
-      </w:r>
+      <w:pPr>
+        <w:ind w:left="340"/>
+      </w:pPr>
       <w:r>
         <w:rPr>
           <w:b/>
@@ -1310,9 +1323,9 @@
       </w:r>
     </w:p>
     <w:p>
-      <w:r>
-        <w:t xml:space="preserve">&gt; </w:t>
-      </w:r>
+      <w:pPr>
+        <w:ind w:left="340"/>
+      </w:pPr>
       <w:r>
         <w:rPr>
           <w:b/>
@@ -1409,9 +1422,9 @@
       </w:r>
     </w:p>
     <w:p>
-      <w:r>
-        <w:t xml:space="preserve">&gt; </w:t>
-      </w:r>
+      <w:pPr>
+        <w:ind w:left="340"/>
+      </w:pPr>
       <w:r>
         <w:rPr>
           <w:b/>
@@ -1577,9 +1590,9 @@
       </w:r>
     </w:p>
     <w:p>
-      <w:r>
-        <w:t xml:space="preserve">&gt; </w:t>
-      </w:r>
+      <w:pPr>
+        <w:ind w:left="340"/>
+      </w:pPr>
       <w:r>
         <w:rPr>
           <w:b/>
@@ -1737,8 +1750,11 @@
       </w:r>
     </w:p>
     <w:p>
-      <w:r>
-        <w:t xml:space="preserve">&gt; Donc une </w:t>
+      <w:pPr>
+        <w:ind w:left="340"/>
+      </w:pPr>
+      <w:r>
+        <w:t xml:space="preserve">Donc une </w:t>
       </w:r>
       <w:r>
         <w:rPr>
@@ -1828,9 +1844,9 @@
       </w:r>
     </w:p>
     <w:p>
-      <w:r>
-        <w:t xml:space="preserve">&gt; </w:t>
-      </w:r>
+      <w:pPr>
+        <w:ind w:left="340"/>
+      </w:pPr>
       <w:r>
         <w:rPr>
           <w:b/>
@@ -2258,9 +2274,9 @@
       </w:r>
     </w:p>
     <w:p>
-      <w:r>
-        <w:t xml:space="preserve">&gt; </w:t>
-      </w:r>
+      <w:pPr>
+        <w:ind w:left="340"/>
+      </w:pPr>
       <w:r>
         <w:rPr>
           <w:b/>
@@ -2339,9 +2355,9 @@
       </w:r>
     </w:p>
     <w:p>
-      <w:r>
-        <w:t xml:space="preserve">&gt; </w:t>
-      </w:r>
+      <w:pPr>
+        <w:ind w:left="340"/>
+      </w:pPr>
       <w:r>
         <w:rPr>
           <w:b/>
@@ -2428,9 +2444,9 @@
       </w:r>
     </w:p>
     <w:p>
-      <w:r>
-        <w:t xml:space="preserve">&gt; </w:t>
-      </w:r>
+      <w:pPr>
+        <w:ind w:left="340"/>
+      </w:pPr>
       <w:r>
         <w:rPr>
           <w:b/>
@@ -2542,9 +2558,9 @@
       </w:r>
     </w:p>
     <w:p>
-      <w:r>
-        <w:t xml:space="preserve">&gt; </w:t>
-      </w:r>
+      <w:pPr>
+        <w:ind w:left="340"/>
+      </w:pPr>
       <w:r>
         <w:rPr>
           <w:b/>
@@ -2635,9 +2651,9 @@
       </w:r>
     </w:p>
     <w:p>
-      <w:r>
-        <w:t xml:space="preserve">&gt; </w:t>
-      </w:r>
+      <w:pPr>
+        <w:ind w:left="340"/>
+      </w:pPr>
       <w:r>
         <w:rPr>
           <w:b/>
@@ -2737,9 +2753,9 @@
       </w:r>
     </w:p>
     <w:p>
-      <w:r>
-        <w:t xml:space="preserve">&gt; </w:t>
-      </w:r>
+      <w:pPr>
+        <w:ind w:left="340"/>
+      </w:pPr>
       <w:r>
         <w:rPr>
           <w:b/>
@@ -2862,9 +2878,9 @@
       </w:r>
     </w:p>
     <w:p>
-      <w:r>
-        <w:t xml:space="preserve">&gt; </w:t>
-      </w:r>
+      <w:pPr>
+        <w:ind w:left="340"/>
+      </w:pPr>
       <w:r>
         <w:rPr>
           <w:b/>
@@ -2945,9 +2961,9 @@
       </w:r>
     </w:p>
     <w:p>
-      <w:r>
-        <w:t xml:space="preserve">&gt; </w:t>
-      </w:r>
+      <w:pPr>
+        <w:ind w:left="340"/>
+      </w:pPr>
       <w:r>
         <w:rPr>
           <w:b/>
@@ -3097,9 +3113,9 @@
       </w:r>
     </w:p>
     <w:p>
-      <w:r>
-        <w:t xml:space="preserve">&gt; </w:t>
-      </w:r>
+      <w:pPr>
+        <w:ind w:left="340"/>
+      </w:pPr>
       <w:r>
         <w:rPr>
           <w:b/>
@@ -3209,9 +3225,9 @@
       </w:r>
     </w:p>
     <w:p>
-      <w:r>
-        <w:t xml:space="preserve">&gt; </w:t>
-      </w:r>
+      <w:pPr>
+        <w:ind w:left="340"/>
+      </w:pPr>
       <w:r>
         <w:rPr>
           <w:b/>
@@ -3333,9 +3349,9 @@
       </w:r>
     </w:p>
     <w:p>
-      <w:r>
-        <w:t xml:space="preserve">&gt; </w:t>
-      </w:r>
+      <w:pPr>
+        <w:ind w:left="340"/>
+      </w:pPr>
       <w:r>
         <w:rPr>
           <w:b/>
@@ -3423,9 +3439,9 @@
       </w:r>
     </w:p>
     <w:p>
-      <w:r>
-        <w:t xml:space="preserve">&gt; </w:t>
-      </w:r>
+      <w:pPr>
+        <w:ind w:left="340"/>
+      </w:pPr>
       <w:r>
         <w:rPr>
           <w:b/>
@@ -3517,9 +3533,9 @@
       </w:r>
     </w:p>
     <w:p>
-      <w:r>
-        <w:t xml:space="preserve">&gt; </w:t>
-      </w:r>
+      <w:pPr>
+        <w:ind w:left="340"/>
+      </w:pPr>
       <w:r>
         <w:rPr>
           <w:b/>
@@ -3629,9 +3645,9 @@
       </w:r>
     </w:p>
     <w:p>
-      <w:r>
-        <w:t xml:space="preserve">&gt; </w:t>
-      </w:r>
+      <w:pPr>
+        <w:ind w:left="340"/>
+      </w:pPr>
       <w:r>
         <w:rPr>
           <w:b/>
@@ -3723,9 +3739,9 @@
       </w:r>
     </w:p>
     <w:p>
-      <w:r>
-        <w:t xml:space="preserve">&gt; </w:t>
-      </w:r>
+      <w:pPr>
+        <w:ind w:left="340"/>
+      </w:pPr>
       <w:r>
         <w:rPr>
           <w:b/>
@@ -3805,9 +3821,9 @@
       </w:r>
     </w:p>
     <w:p>
-      <w:r>
-        <w:t xml:space="preserve">&gt; </w:t>
-      </w:r>
+      <w:pPr>
+        <w:ind w:left="340"/>
+      </w:pPr>
       <w:r>
         <w:rPr>
           <w:b/>
@@ -3889,9 +3905,9 @@
       </w:r>
     </w:p>
     <w:p>
-      <w:r>
-        <w:t xml:space="preserve">&gt; </w:t>
-      </w:r>
+      <w:pPr>
+        <w:ind w:left="340"/>
+      </w:pPr>
       <w:r>
         <w:rPr>
           <w:b/>
@@ -4003,9 +4019,9 @@
       </w:r>
     </w:p>
     <w:p>
-      <w:r>
-        <w:t xml:space="preserve">&gt; </w:t>
-      </w:r>
+      <w:pPr>
+        <w:ind w:left="340"/>
+      </w:pPr>
       <w:r>
         <w:rPr>
           <w:b/>
@@ -4115,9 +4131,9 @@
       </w:r>
     </w:p>
     <w:p>
-      <w:r>
-        <w:t xml:space="preserve">&gt; </w:t>
-      </w:r>
+      <w:pPr>
+        <w:ind w:left="340"/>
+      </w:pPr>
       <w:r>
         <w:rPr>
           <w:b/>
@@ -5249,21 +5265,30 @@
         <w:pStyle w:val="Heading2"/>
       </w:pPr>
       <w:r>
-        <w:t>Le mot de la fin — pourquoi tout ça compte</w:t>
+        <w:t>Le moteur de signaux mémoire — « 1 source, N surfaces »</w:t>
       </w:r>
     </w:p>
     <w:p>
       <w:r>
-        <w:t xml:space="preserve">Chaque notion ci-dessus n'est pas là « parce que c'est moderne ». Chacune sert </w:t>
+        <w:t xml:space="preserve">Comment le tableau de bord, le planning et les passages de témoin affichent-ils les </w:t>
       </w:r>
       <w:r>
         <w:rPr>
           <w:b/>
         </w:rPr>
-        <w:t>une des deux missions</w:t>
-      </w:r>
-      <w:r>
-        <w:t xml:space="preserve"> de MemorIA :</w:t>
+        <w:t>mêmes</w:t>
+      </w:r>
+      <w:r>
+        <w:t xml:space="preserve"> signaux sans les recalculer chacun de leur côté ? Grâce à un petit moteur en </w:t>
+      </w:r>
+      <w:r>
+        <w:rPr>
+          <w:b/>
+        </w:rPr>
+        <w:t>4 couches</w:t>
+      </w:r>
+      <w:r>
+        <w:t xml:space="preserve"> :</w:t>
       </w:r>
     </w:p>
     <w:p>
@@ -5274,10 +5299,29 @@
         <w:rPr>
           <w:b/>
         </w:rPr>
-        <w:t>Faire émerger la bonne mémoire au bon moment</w:t>
-      </w:r>
-      <w:r>
-        <w:t xml:space="preserve"> → embeddings, pgvector, cosine, chunking, pipeline IA</w:t>
+        <w:t>Détecteurs</w:t>
+      </w:r>
+      <w:r>
+        <w:t xml:space="preserve"> (</w:t>
+      </w:r>
+      <w:r>
+        <w:rPr>
+          <w:rFonts w:ascii="Consolas" w:hAnsi="Consolas"/>
+          <w:sz w:val="20"/>
+        </w:rPr>
+        <w:t>lib/memory/signals/*</w:t>
+      </w:r>
+      <w:r>
+        <w:t xml:space="preserve">) — des fonctions </w:t>
+      </w:r>
+      <w:r>
+        <w:rPr>
+          <w:b/>
+        </w:rPr>
+        <w:t>pures et déterministes</w:t>
+      </w:r>
+      <w:r>
+        <w:t xml:space="preserve"> qui produisent des faits : « ce site n'a pas parlé depuis 12 jours », « cette passation attend une reconnaissance ». Pas d'IA, pas de LLM — du SQL et des règles.</w:t>
       </w:r>
     </w:p>
     <w:p>
@@ -5288,39 +5332,365 @@
         <w:rPr>
           <w:b/>
         </w:rPr>
-        <w:t>Ne jamais trahir la doctrine</w:t>
-      </w:r>
-      <w:r>
-        <w:t xml:space="preserve"> → RLS, tripwires, allowlists, kill switches, audit log, soft delete, snapshot immuable</w:t>
+        <w:t>Collecteur</w:t>
+      </w:r>
+      <w:r>
+        <w:t xml:space="preserve"> — lance tous les détecteurs, à plat (aucun classement global).</w:t>
       </w:r>
     </w:p>
     <w:p>
-      <w:r>
-        <w:t xml:space="preserve">Le niveau d'ingénierie est sérieux </w:t>
-      </w:r>
+      <w:pPr>
+        <w:pStyle w:val="ListNumber"/>
+      </w:pPr>
       <w:r>
         <w:rPr>
           <w:b/>
         </w:rPr>
-        <w:t>parce que la promesse est sérieuse</w:t>
-      </w:r>
-      <w:r>
-        <w:t xml:space="preserve"> : un système qui touche à la mémoire des gens et aux opérations d'une entreprise ne peut pas se permettre d'être bricolé. La solidité technique </w:t>
+        <w:t>Contextualiseur</w:t>
+      </w:r>
+      <w:r>
+        <w:t xml:space="preserve"> (</w:t>
+      </w:r>
+      <w:r>
+        <w:rPr>
+          <w:rFonts w:ascii="Consolas" w:hAnsi="Consolas"/>
+          <w:sz w:val="20"/>
+        </w:rPr>
+        <w:t>forSurface</w:t>
+      </w:r>
+      <w:r>
+        <w:t xml:space="preserve">) — décide </w:t>
       </w:r>
       <w:r>
         <w:rPr>
           <w:b/>
         </w:rPr>
-        <w:t>est</w:t>
-      </w:r>
-      <w:r>
-        <w:t xml:space="preserve"> la condition de la confiance.</w:t>
+        <w:t>quand parler</w:t>
+      </w:r>
+      <w:r>
+        <w:t xml:space="preserve"> selon la surface (dashboard ≠ planning) et résout les conflits (un signal de santé masque un signal fragile).</w:t>
       </w:r>
     </w:p>
     <w:p>
-      <w:r>
-        <w:t xml:space="preserve">&gt; </w:t>
-      </w:r>
+      <w:pPr>
+        <w:pStyle w:val="ListNumber"/>
+      </w:pPr>
+      <w:r>
+        <w:rPr>
+          <w:b/>
+        </w:rPr>
+        <w:t>Renderer</w:t>
+      </w:r>
+      <w:r>
+        <w:t xml:space="preserve"> — le </w:t>
+      </w:r>
+      <w:r>
+        <w:rPr>
+          <w:b/>
+        </w:rPr>
+        <w:t>seul</w:t>
+      </w:r>
+      <w:r>
+        <w:t xml:space="preserve"> responsable du texte affiché.</w:t>
+      </w:r>
+    </w:p>
+    <w:p>
+      <w:r>
+        <w:rPr>
+          <w:b/>
+          <w:color w:val="C0392B"/>
+        </w:rPr>
+        <w:t>La grammaire stricte</w:t>
+      </w:r>
+    </w:p>
+    <w:p>
+      <w:pPr>
+        <w:ind w:left="340"/>
+      </w:pPr>
+      <w:r>
+        <w:t xml:space="preserve">Un signal ne contient </w:t>
+      </w:r>
+      <w:r>
+        <w:rPr>
+          <w:b/>
+        </w:rPr>
+        <w:t>jamais</w:t>
+      </w:r>
+      <w:r>
+        <w:t xml:space="preserve"> de texte, ni de personne comme sujet, ni de score caché. Le sujet est </w:t>
+      </w:r>
+      <w:r>
+        <w:rPr>
+          <w:b/>
+        </w:rPr>
+        <w:t>un lieu ou une équipe, jamais un individu</w:t>
+      </w:r>
+      <w:r>
+        <w:t>. Cette discipline est testée (tests dans le même commit).</w:t>
+      </w:r>
+    </w:p>
+    <w:p>
+      <w:r>
+        <w:t xml:space="preserve">Résultat : </w:t>
+      </w:r>
+      <w:r>
+        <w:rPr>
+          <w:b/>
+        </w:rPr>
+        <w:t>une seule source de vérité</w:t>
+      </w:r>
+      <w:r>
+        <w:t>, déclinée sur plusieurs écrans, expliquée et réversible.</w:t>
+      </w:r>
+    </w:p>
+    <w:p>
+      <w:pPr>
+        <w:pStyle w:val="Heading2"/>
+      </w:pPr>
+      <w:r>
+        <w:t>Le pipeline d'ingestion documentaire</w:t>
+      </w:r>
+    </w:p>
+    <w:p>
+      <w:r>
+        <w:t xml:space="preserve">Importer un document n'est pas « le vectoriser ». C'est un </w:t>
+      </w:r>
+      <w:r>
+        <w:rPr>
+          <w:b/>
+        </w:rPr>
+        <w:t>pipeline</w:t>
+      </w:r>
+      <w:r>
+        <w:t xml:space="preserve"> qui décide d'abord </w:t>
+      </w:r>
+      <w:r>
+        <w:rPr>
+          <w:i/>
+        </w:rPr>
+        <w:t>si</w:t>
+      </w:r>
+      <w:r>
+        <w:t xml:space="preserve"> le document mérite la mémoire active :</w:t>
+      </w:r>
+    </w:p>
+    <w:p>
+      <w:r>
+        <w:rPr>
+          <w:rFonts w:ascii="Consolas" w:hAnsi="Consolas"/>
+          <w:sz w:val="18"/>
+        </w:rPr>
+        <w:t>PDF déposé</w:t>
+        <w:br/>
+        <w:t xml:space="preserve">  → classifyDocument()      (pur : type → couche + reco d'indexation + pourquoi)</w:t>
+        <w:br/>
+        <w:t xml:space="preserve">  → triage humain           (l'humain valide type / indexation)</w:t>
+        <w:br/>
+        <w:t xml:space="preserve">  → createDocument()        (stockage privé + métadonnées + memory_tier)</w:t>
+        <w:br/>
+        <w:t xml:space="preserve">  → analyzeDocument()       (UNIQUEMENT si indexation validée)</w:t>
+        <w:br/>
+        <w:t xml:space="preserve">       → extraction → chunking sémantique → embeddings → knowledge_chunks</w:t>
+      </w:r>
+    </w:p>
+    <w:p>
+      <w:r>
+        <w:rPr>
+          <w:b/>
+          <w:color w:val="C0392B"/>
+        </w:rPr>
+        <w:t>Embedding sélectif</w:t>
+      </w:r>
+    </w:p>
+    <w:p>
+      <w:pPr>
+        <w:ind w:left="340"/>
+      </w:pPr>
+      <w:r>
+        <w:t xml:space="preserve">On ne lance l'étape coûteuse (embeddings) </w:t>
+      </w:r>
+      <w:r>
+        <w:rPr>
+          <w:b/>
+        </w:rPr>
+        <w:t>que</w:t>
+      </w:r>
+      <w:r>
+        <w:t xml:space="preserve"> pour les documents « vivante » / « consultable ». Les archives froides sont stockées sans coût IA. C'est la </w:t>
+      </w:r>
+      <w:r>
+        <w:rPr>
+          <w:rFonts w:ascii="Consolas" w:hAnsi="Consolas"/>
+          <w:sz w:val="20"/>
+        </w:rPr>
+        <w:t>ai-cost-discipline</w:t>
+      </w:r>
+      <w:r>
+        <w:t xml:space="preserve"> appliquée : async, borné, jamais « LLM partout ».</w:t>
+      </w:r>
+    </w:p>
+    <w:p>
+      <w:r>
+        <w:rPr>
+          <w:b/>
+          <w:color w:val="C0392B"/>
+        </w:rPr>
+        <w:t>Garde-fou litige</w:t>
+      </w:r>
+    </w:p>
+    <w:p>
+      <w:pPr>
+        <w:ind w:left="340"/>
+      </w:pPr>
+      <w:r>
+        <w:t xml:space="preserve">Un document de type </w:t>
+      </w:r>
+      <w:r>
+        <w:rPr>
+          <w:b/>
+        </w:rPr>
+        <w:t>litige</w:t>
+      </w:r>
+      <w:r>
+        <w:t xml:space="preserve"> est forcé en </w:t>
+      </w:r>
+      <w:r>
+        <w:rPr>
+          <w:i/>
+        </w:rPr>
+        <w:t>non indexé</w:t>
+      </w:r>
+      <w:r>
+        <w:t xml:space="preserve"> </w:t>
+      </w:r>
+      <w:r>
+        <w:rPr>
+          <w:b/>
+        </w:rPr>
+        <w:t>côté serveur</w:t>
+      </w:r>
+      <w:r>
+        <w:t xml:space="preserve"> — on ne fait pas confiance au client. Un litige n'alimente jamais une lecture ou une résonance automatique.</w:t>
+      </w:r>
+    </w:p>
+    <w:p>
+      <w:r>
+        <w:t xml:space="preserve">L'import par lot réutilise </w:t>
+      </w:r>
+      <w:r>
+        <w:rPr>
+          <w:b/>
+        </w:rPr>
+        <w:t>exactement</w:t>
+      </w:r>
+      <w:r>
+        <w:t xml:space="preserve"> ce pipeline (même action, mêmes garde-fous), avec une </w:t>
+      </w:r>
+      <w:r>
+        <w:rPr>
+          <w:b/>
+        </w:rPr>
+        <w:t>file bornée</w:t>
+      </w:r>
+      <w:r>
+        <w:t xml:space="preserve"> (3 fichiers à la fois, jamais 50 en parallèle) et un </w:t>
+      </w:r>
+      <w:r>
+        <w:rPr>
+          <w:b/>
+        </w:rPr>
+        <w:t>import partiel</w:t>
+      </w:r>
+      <w:r>
+        <w:t xml:space="preserve"> (un PDF corrompu n'arrête pas les autres). Aucune nouvelle infra : on </w:t>
+      </w:r>
+      <w:r>
+        <w:rPr>
+          <w:b/>
+        </w:rPr>
+        <w:t>étend</w:t>
+      </w:r>
+      <w:r>
+        <w:t xml:space="preserve"> l'existant, on ne le double pas.</w:t>
+      </w:r>
+    </w:p>
+    <w:p>
+      <w:pPr>
+        <w:pStyle w:val="Heading2"/>
+      </w:pPr>
+      <w:r>
+        <w:t>Le mot de la fin — pourquoi tout ça compte</w:t>
+      </w:r>
+    </w:p>
+    <w:p>
+      <w:r>
+        <w:t xml:space="preserve">Chaque notion ci-dessus n'est pas là « parce que c'est moderne ». Chacune sert </w:t>
+      </w:r>
+      <w:r>
+        <w:rPr>
+          <w:b/>
+        </w:rPr>
+        <w:t>une des deux missions</w:t>
+      </w:r>
+      <w:r>
+        <w:t xml:space="preserve"> de MemorIA :</w:t>
+      </w:r>
+    </w:p>
+    <w:p>
+      <w:pPr>
+        <w:pStyle w:val="ListNumber"/>
+      </w:pPr>
+      <w:r>
+        <w:rPr>
+          <w:b/>
+        </w:rPr>
+        <w:t>Faire émerger la bonne mémoire au bon moment</w:t>
+      </w:r>
+      <w:r>
+        <w:t xml:space="preserve"> → embeddings, pgvector, cosine, chunking, pipeline IA</w:t>
+      </w:r>
+    </w:p>
+    <w:p>
+      <w:pPr>
+        <w:pStyle w:val="ListNumber"/>
+      </w:pPr>
+      <w:r>
+        <w:rPr>
+          <w:b/>
+        </w:rPr>
+        <w:t>Ne jamais trahir la doctrine</w:t>
+      </w:r>
+      <w:r>
+        <w:t xml:space="preserve"> → RLS, tripwires, allowlists, kill switches, audit log, soft delete, snapshot immuable</w:t>
+      </w:r>
+    </w:p>
+    <w:p>
+      <w:r>
+        <w:t xml:space="preserve">Le niveau d'ingénierie est sérieux </w:t>
+      </w:r>
+      <w:r>
+        <w:rPr>
+          <w:b/>
+        </w:rPr>
+        <w:t>parce que la promesse est sérieuse</w:t>
+      </w:r>
+      <w:r>
+        <w:t xml:space="preserve"> : un système qui touche à la mémoire des gens et aux opérations d'une entreprise ne peut pas se permettre d'être bricolé. La solidité technique </w:t>
+      </w:r>
+      <w:r>
+        <w:rPr>
+          <w:b/>
+        </w:rPr>
+        <w:t>est</w:t>
+      </w:r>
+      <w:r>
+        <w:t xml:space="preserve"> la condition de la confiance.</w:t>
+      </w:r>
+    </w:p>
+    <w:p>
+      <w:pPr>
+        <w:ind w:left="340"/>
+      </w:pPr>
       <w:r>
         <w:rPr>
           <w:i/>

</xml_diff>